<commit_message>
docs: texto do relatorio justificado (corpo, listas e citacoes), legendas centralizadas
</commit_message>
<xml_diff>
--- a/docs/RELATORIO-TECNICO.docx
+++ b/docs/RELATORIO-TECNICO.docx
@@ -248,6 +248,7 @@
     <w:p>
       <w:pPr>
         <w:pStyle w:val="Normal"/>
+        <w:jc w:val="both"/>
       </w:pPr>
       <w:r>
         <w:rPr/>
@@ -297,6 +298,7 @@
     <w:p>
       <w:pPr>
         <w:pStyle w:val="Normal"/>
+        <w:jc w:val="both"/>
       </w:pPr>
       <w:r>
         <w:rPr/>
@@ -616,6 +618,7 @@
     <w:p>
       <w:pPr>
         <w:pStyle w:val="Normal"/>
+        <w:jc w:val="both"/>
       </w:pPr>
       <w:r>
         <w:rPr/>
@@ -669,6 +672,7 @@
           <w:ilvl w:val="0"/>
           <w:numId w:val="1"/>
         </w:numPr>
+        <w:jc w:val="both"/>
       </w:pPr>
       <w:r>
         <w:rPr/>
@@ -692,6 +696,7 @@
           <w:ilvl w:val="0"/>
           <w:numId w:val="1"/>
         </w:numPr>
+        <w:jc w:val="both"/>
       </w:pPr>
       <w:r>
         <w:rPr/>
@@ -711,6 +716,7 @@
     <w:p>
       <w:pPr>
         <w:pStyle w:val="Normal"/>
+        <w:jc w:val="both"/>
       </w:pPr>
       <w:r>
         <w:rPr/>
@@ -724,6 +730,7 @@
           <w:ilvl w:val="0"/>
           <w:numId w:val="1"/>
         </w:numPr>
+        <w:jc w:val="both"/>
       </w:pPr>
       <w:r>
         <w:rPr/>
@@ -747,6 +754,7 @@
           <w:ilvl w:val="0"/>
           <w:numId w:val="1"/>
         </w:numPr>
+        <w:jc w:val="both"/>
       </w:pPr>
       <w:r>
         <w:rPr/>
@@ -756,6 +764,7 @@
     <w:p>
       <w:pPr>
         <w:pStyle w:val="Normal"/>
+        <w:jc w:val="both"/>
       </w:pPr>
       <w:r>
         <w:rPr>
@@ -984,6 +993,7 @@
     <w:p>
       <w:pPr>
         <w:pStyle w:val="Normal"/>
+        <w:jc w:val="both"/>
       </w:pPr>
       <w:r>
         <w:rPr>
@@ -1029,6 +1039,7 @@
     <w:p>
       <w:pPr>
         <w:pStyle w:val="CitaoIntensa"/>
+        <w:jc w:val="both"/>
       </w:pPr>
       <w:r>
         <w:rPr>
@@ -1064,6 +1075,7 @@
     <w:p>
       <w:pPr>
         <w:pStyle w:val="CitaoIntensa"/>
+        <w:jc w:val="both"/>
       </w:pPr>
       <w:r>
         <w:rPr/>
@@ -1083,6 +1095,7 @@
     <w:p>
       <w:pPr>
         <w:pStyle w:val="CitaoIntensa"/>
+        <w:jc w:val="both"/>
       </w:pPr>
       <w:r>
         <w:rPr/>
@@ -1092,6 +1105,7 @@
     <w:p>
       <w:pPr>
         <w:pStyle w:val="Normal"/>
+        <w:jc w:val="both"/>
       </w:pPr>
       <w:r>
         <w:rPr/>
@@ -1139,6 +1153,7 @@
     <w:p>
       <w:pPr>
         <w:pStyle w:val="Normal"/>
+        <w:jc w:val="both"/>
       </w:pPr>
       <w:r>
         <w:rPr/>
@@ -1175,6 +1190,7 @@
     <w:p>
       <w:pPr>
         <w:pStyle w:val="Normal"/>
+        <w:jc w:val="both"/>
       </w:pPr>
       <w:r>
         <w:rPr/>
@@ -1445,6 +1461,7 @@
     <w:p>
       <w:pPr>
         <w:pStyle w:val="Normal"/>
+        <w:jc w:val="both"/>
       </w:pPr>
       <w:r>
         <w:rPr>
@@ -1913,6 +1930,7 @@
     <w:p>
       <w:pPr>
         <w:pStyle w:val="Normal"/>
+        <w:jc w:val="both"/>
       </w:pPr>
       <w:r>
         <w:rPr/>
@@ -2012,6 +2030,7 @@
     <w:p>
       <w:pPr>
         <w:pStyle w:val="Normal"/>
+        <w:jc w:val="both"/>
       </w:pPr>
       <w:r>
         <w:rPr/>
@@ -2051,6 +2070,7 @@
     <w:p>
       <w:pPr>
         <w:pStyle w:val="PargrafodaLista"/>
+        <w:jc w:val="both"/>
       </w:pPr>
       <w:r>
         <w:rPr/>
@@ -2060,6 +2080,7 @@
     <w:p>
       <w:pPr>
         <w:pStyle w:val="PargrafodaLista"/>
+        <w:jc w:val="both"/>
       </w:pPr>
       <w:r>
         <w:rPr/>
@@ -2069,6 +2090,7 @@
     <w:p>
       <w:pPr>
         <w:pStyle w:val="PargrafodaLista"/>
+        <w:jc w:val="both"/>
       </w:pPr>
       <w:r>
         <w:rPr/>
@@ -2078,6 +2100,7 @@
     <w:p>
       <w:pPr>
         <w:pStyle w:val="PargrafodaLista"/>
+        <w:jc w:val="both"/>
       </w:pPr>
       <w:r>
         <w:rPr>
@@ -2093,6 +2116,7 @@
     <w:p>
       <w:pPr>
         <w:pStyle w:val="Normal"/>
+        <w:jc w:val="both"/>
       </w:pPr>
       <w:r>
         <w:rPr>
@@ -2509,6 +2533,7 @@
     <w:p>
       <w:pPr>
         <w:pStyle w:val="Normal"/>
+        <w:jc w:val="both"/>
       </w:pPr>
       <w:r>
         <w:rPr/>
@@ -2912,6 +2937,7 @@
     <w:p>
       <w:pPr>
         <w:pStyle w:val="Normal"/>
+        <w:jc w:val="both"/>
       </w:pPr>
       <w:r>
         <w:rPr/>
@@ -2961,6 +2987,7 @@
     <w:p>
       <w:pPr>
         <w:pStyle w:val="Normal"/>
+        <w:jc w:val="both"/>
       </w:pPr>
       <w:r>
         <w:rPr>
@@ -2972,6 +2999,7 @@
     <w:p>
       <w:pPr>
         <w:pStyle w:val="PargrafodaLista"/>
+        <w:jc w:val="both"/>
       </w:pPr>
       <w:r>
         <w:rPr/>
@@ -2991,6 +3019,7 @@
     <w:p>
       <w:pPr>
         <w:pStyle w:val="PargrafodaLista"/>
+        <w:jc w:val="both"/>
       </w:pPr>
       <w:r>
         <w:rPr/>
@@ -3020,6 +3049,7 @@
     <w:p>
       <w:pPr>
         <w:pStyle w:val="Normal"/>
+        <w:jc w:val="both"/>
       </w:pPr>
       <w:r>
         <w:rPr/>
@@ -3039,6 +3069,7 @@
     <w:p>
       <w:pPr>
         <w:pStyle w:val="PargrafodaLista"/>
+        <w:jc w:val="both"/>
       </w:pPr>
       <w:r>
         <w:rPr/>
@@ -3078,6 +3109,7 @@
     <w:p>
       <w:pPr>
         <w:pStyle w:val="Normal"/>
+        <w:jc w:val="both"/>
       </w:pPr>
       <w:r>
         <w:rPr/>
@@ -3126,6 +3158,7 @@
     <w:p>
       <w:pPr>
         <w:pStyle w:val="Normal"/>
+        <w:jc w:val="both"/>
       </w:pPr>
       <w:r>
         <w:rPr>
@@ -3171,6 +3204,7 @@
     <w:p>
       <w:pPr>
         <w:pStyle w:val="Normal"/>
+        <w:jc w:val="both"/>
       </w:pPr>
       <w:r>
         <w:rPr/>
@@ -3200,6 +3234,7 @@
     <w:p>
       <w:pPr>
         <w:pStyle w:val="Normal"/>
+        <w:jc w:val="both"/>
       </w:pPr>
       <w:r>
         <w:rPr/>
@@ -3249,6 +3284,7 @@
     <w:p>
       <w:pPr>
         <w:pStyle w:val="CitaoIntensa"/>
+        <w:jc w:val="both"/>
       </w:pPr>
       <w:r>
         <w:rPr>
@@ -3294,6 +3330,7 @@
     <w:p>
       <w:pPr>
         <w:pStyle w:val="CitaoIntensa"/>
+        <w:jc w:val="both"/>
       </w:pPr>
       <w:r>
         <w:rPr>
@@ -3319,6 +3356,7 @@
     <w:p>
       <w:pPr>
         <w:pStyle w:val="CitaoIntensa"/>
+        <w:jc w:val="both"/>
       </w:pPr>
       <w:r>
         <w:rPr/>
@@ -3338,6 +3376,7 @@
     <w:p>
       <w:pPr>
         <w:pStyle w:val="CitaoIntensa"/>
+        <w:jc w:val="both"/>
       </w:pPr>
       <w:r>
         <w:rPr/>
@@ -3561,6 +3600,7 @@
     <w:p>
       <w:pPr>
         <w:pStyle w:val="Normal"/>
+        <w:jc w:val="both"/>
       </w:pPr>
       <w:r>
         <w:rPr/>
@@ -3647,6 +3687,7 @@
     <w:p>
       <w:pPr>
         <w:pStyle w:val="Normal"/>
+        <w:jc w:val="both"/>
       </w:pPr>
       <w:r>
         <w:rPr/>
@@ -4120,6 +4161,7 @@
     <w:p>
       <w:pPr>
         <w:pStyle w:val="Normal"/>
+        <w:jc w:val="both"/>
       </w:pPr>
       <w:r>
         <w:rPr>
@@ -4145,6 +4187,7 @@
     <w:p>
       <w:pPr>
         <w:pStyle w:val="Normal"/>
+        <w:jc w:val="both"/>
       </w:pPr>
       <w:r>
         <w:rPr>
@@ -4190,6 +4233,7 @@
     <w:p>
       <w:pPr>
         <w:pStyle w:val="Normal"/>
+        <w:jc w:val="both"/>
       </w:pPr>
       <w:r>
         <w:rPr>
@@ -4228,6 +4272,7 @@
           <w:ilvl w:val="0"/>
           <w:numId w:val="1"/>
         </w:numPr>
+        <w:jc w:val="both"/>
       </w:pPr>
       <w:r>
         <w:rPr>
@@ -4253,6 +4298,7 @@
     <w:p>
       <w:pPr>
         <w:pStyle w:val="Normal"/>
+        <w:jc w:val="both"/>
       </w:pPr>
       <w:r>
         <w:rPr/>
@@ -4276,6 +4322,7 @@
           <w:ilvl w:val="0"/>
           <w:numId w:val="1"/>
         </w:numPr>
+        <w:jc w:val="both"/>
       </w:pPr>
       <w:r>
         <w:rPr>
@@ -4311,6 +4358,7 @@
     <w:p>
       <w:pPr>
         <w:pStyle w:val="Normal"/>
+        <w:jc w:val="both"/>
       </w:pPr>
       <w:r>
         <w:rPr/>
@@ -4334,6 +4382,7 @@
           <w:ilvl w:val="0"/>
           <w:numId w:val="1"/>
         </w:numPr>
+        <w:jc w:val="both"/>
       </w:pPr>
       <w:r>
         <w:rPr>
@@ -4359,6 +4408,7 @@
     <w:p>
       <w:pPr>
         <w:pStyle w:val="Normal"/>
+        <w:jc w:val="both"/>
       </w:pPr>
       <w:r>
         <w:rPr/>
@@ -5081,6 +5131,7 @@
           <w:ilvl w:val="0"/>
           <w:numId w:val="1"/>
         </w:numPr>
+        <w:jc w:val="both"/>
       </w:pPr>
       <w:r>
         <w:rPr>
@@ -5100,6 +5151,7 @@
           <w:ilvl w:val="0"/>
           <w:numId w:val="1"/>
         </w:numPr>
+        <w:jc w:val="both"/>
       </w:pPr>
       <w:r>
         <w:rPr>
@@ -5129,6 +5181,7 @@
           <w:ilvl w:val="0"/>
           <w:numId w:val="1"/>
         </w:numPr>
+        <w:jc w:val="both"/>
       </w:pPr>
       <w:r>
         <w:rPr>
@@ -5164,6 +5217,7 @@
     <w:p>
       <w:pPr>
         <w:pStyle w:val="Normal"/>
+        <w:jc w:val="both"/>
       </w:pPr>
       <w:r>
         <w:rPr>
@@ -5183,6 +5237,7 @@
           <w:ilvl w:val="0"/>
           <w:numId w:val="1"/>
         </w:numPr>
+        <w:jc w:val="both"/>
       </w:pPr>
       <w:r>
         <w:rPr>
@@ -5198,6 +5253,7 @@
     <w:p>
       <w:pPr>
         <w:pStyle w:val="Normal"/>
+        <w:jc w:val="both"/>
       </w:pPr>
       <w:r>
         <w:rPr/>
@@ -5221,6 +5277,7 @@
           <w:ilvl w:val="0"/>
           <w:numId w:val="1"/>
         </w:numPr>
+        <w:jc w:val="both"/>
       </w:pPr>
       <w:r>
         <w:rPr>
@@ -5236,6 +5293,7 @@
     <w:p>
       <w:pPr>
         <w:pStyle w:val="Normal"/>
+        <w:jc w:val="both"/>
       </w:pPr>
       <w:r>
         <w:rPr/>
@@ -5284,6 +5342,7 @@
     <w:p>
       <w:pPr>
         <w:pStyle w:val="Normal"/>
+        <w:jc w:val="both"/>
       </w:pPr>
       <w:r>
         <w:rPr>
@@ -5622,6 +5681,7 @@
     <w:p>
       <w:pPr>
         <w:pStyle w:val="Normal"/>
+        <w:jc w:val="both"/>
       </w:pPr>
       <w:r>
         <w:rPr>
@@ -5943,6 +6003,7 @@
     <w:p>
       <w:pPr>
         <w:pStyle w:val="Normal"/>
+        <w:jc w:val="both"/>
       </w:pPr>
       <w:r>
         <w:rPr/>
@@ -6467,6 +6528,7 @@
     <w:p>
       <w:pPr>
         <w:pStyle w:val="Normal"/>
+        <w:jc w:val="both"/>
       </w:pPr>
       <w:r>
         <w:rPr>
@@ -6529,6 +6591,7 @@
     <w:p>
       <w:pPr>
         <w:pStyle w:val="Normal"/>
+        <w:jc w:val="both"/>
       </w:pPr>
       <w:r>
         <w:rPr>
@@ -6782,6 +6845,7 @@
     <w:p>
       <w:pPr>
         <w:pStyle w:val="Normal"/>
+        <w:jc w:val="both"/>
       </w:pPr>
       <w:r>
         <w:rPr>
@@ -6846,6 +6910,7 @@
     <w:p>
       <w:pPr>
         <w:pStyle w:val="Normal"/>
+        <w:jc w:val="center"/>
       </w:pPr>
       <w:r>
         <w:rPr>
@@ -6896,6 +6961,7 @@
     <w:p>
       <w:pPr>
         <w:pStyle w:val="Normal"/>
+        <w:jc w:val="center"/>
       </w:pPr>
       <w:r>
         <w:rPr>
@@ -6946,6 +7012,7 @@
     <w:p>
       <w:pPr>
         <w:pStyle w:val="Normal"/>
+        <w:jc w:val="center"/>
       </w:pPr>
       <w:r>
         <w:rPr>
@@ -6976,6 +7043,7 @@
     <w:p>
       <w:pPr>
         <w:pStyle w:val="Normal"/>
+        <w:jc w:val="both"/>
       </w:pPr>
       <w:r>
         <w:rPr/>
@@ -7074,6 +7142,7 @@
     <w:p>
       <w:pPr>
         <w:pStyle w:val="Normal"/>
+        <w:jc w:val="center"/>
       </w:pPr>
       <w:r>
         <w:rPr>
@@ -7367,6 +7436,7 @@
     <w:p>
       <w:pPr>
         <w:pStyle w:val="Normal"/>
+        <w:jc w:val="both"/>
       </w:pPr>
       <w:r>
         <w:rPr>
@@ -7441,6 +7511,7 @@
     <w:p>
       <w:pPr>
         <w:pStyle w:val="Normal"/>
+        <w:jc w:val="center"/>
       </w:pPr>
       <w:r>
         <w:rPr>
@@ -7461,6 +7532,7 @@
     <w:p>
       <w:pPr>
         <w:pStyle w:val="Normal"/>
+        <w:jc w:val="both"/>
       </w:pPr>
       <w:r>
         <w:rPr/>
@@ -7579,6 +7651,7 @@
     <w:p>
       <w:pPr>
         <w:pStyle w:val="Normal"/>
+        <w:jc w:val="center"/>
       </w:pPr>
       <w:r>
         <w:rPr>
@@ -7599,6 +7672,7 @@
     <w:p>
       <w:pPr>
         <w:pStyle w:val="PargrafodaLista"/>
+        <w:jc w:val="both"/>
       </w:pPr>
       <w:r>
         <w:rPr>
@@ -7614,6 +7688,7 @@
     <w:p>
       <w:pPr>
         <w:pStyle w:val="Normal"/>
+        <w:jc w:val="both"/>
       </w:pPr>
       <w:r>
         <w:rPr/>
@@ -7653,6 +7728,7 @@
     <w:p>
       <w:pPr>
         <w:pStyle w:val="PargrafodaLista"/>
+        <w:jc w:val="both"/>
       </w:pPr>
       <w:r>
         <w:rPr>
@@ -7678,6 +7754,7 @@
     <w:p>
       <w:pPr>
         <w:pStyle w:val="Normal"/>
+        <w:jc w:val="both"/>
       </w:pPr>
       <w:r>
         <w:rPr/>
@@ -7746,6 +7823,7 @@
     <w:p>
       <w:pPr>
         <w:pStyle w:val="Normal"/>
+        <w:jc w:val="center"/>
       </w:pPr>
       <w:r>
         <w:rPr>
@@ -7796,6 +7874,7 @@
     <w:p>
       <w:pPr>
         <w:pStyle w:val="Normal"/>
+        <w:jc w:val="center"/>
       </w:pPr>
       <w:r>
         <w:rPr>
@@ -7816,6 +7895,7 @@
     <w:p>
       <w:pPr>
         <w:pStyle w:val="PargrafodaLista"/>
+        <w:jc w:val="both"/>
       </w:pPr>
       <w:r>
         <w:rPr/>
@@ -7835,6 +7915,7 @@
     <w:p>
       <w:pPr>
         <w:pStyle w:val="PargrafodaLista"/>
+        <w:jc w:val="both"/>
       </w:pPr>
       <w:r>
         <w:rPr>
@@ -7860,6 +7941,7 @@
     <w:p>
       <w:pPr>
         <w:pStyle w:val="PargrafodaLista"/>
+        <w:jc w:val="both"/>
       </w:pPr>
       <w:r>
         <w:rPr/>
@@ -7889,6 +7971,7 @@
     <w:p>
       <w:pPr>
         <w:pStyle w:val="PargrafodaLista"/>
+        <w:jc w:val="both"/>
       </w:pPr>
       <w:r>
         <w:rPr>
@@ -7904,6 +7987,7 @@
     <w:p>
       <w:pPr>
         <w:pStyle w:val="PargrafodaLista"/>
+        <w:jc w:val="both"/>
       </w:pPr>
       <w:r>
         <w:rPr>
@@ -7919,6 +8003,7 @@
     <w:p>
       <w:pPr>
         <w:pStyle w:val="PargrafodaLista"/>
+        <w:jc w:val="both"/>
       </w:pPr>
       <w:r>
         <w:rPr>
@@ -7961,6 +8046,7 @@
     <w:p>
       <w:pPr>
         <w:pStyle w:val="Normal"/>
+        <w:jc w:val="both"/>
       </w:pPr>
       <w:r>
         <w:rPr/>
@@ -8336,6 +8422,7 @@
     <w:p>
       <w:pPr>
         <w:pStyle w:val="PargrafodaLista"/>
+        <w:jc w:val="both"/>
       </w:pPr>
       <w:r>
         <w:rPr>
@@ -8351,6 +8438,7 @@
     <w:p>
       <w:pPr>
         <w:pStyle w:val="Normal"/>
+        <w:jc w:val="both"/>
       </w:pPr>
       <w:r>
         <w:rPr/>
@@ -8360,6 +8448,7 @@
     <w:p>
       <w:pPr>
         <w:pStyle w:val="PargrafodaLista"/>
+        <w:jc w:val="both"/>
       </w:pPr>
       <w:r>
         <w:rPr>
@@ -8375,6 +8464,7 @@
     <w:p>
       <w:pPr>
         <w:pStyle w:val="Normal"/>
+        <w:jc w:val="both"/>
       </w:pPr>
       <w:r>
         <w:rPr/>
@@ -8394,6 +8484,7 @@
     <w:p>
       <w:pPr>
         <w:pStyle w:val="PargrafodaLista"/>
+        <w:jc w:val="both"/>
       </w:pPr>
       <w:r>
         <w:rPr>
@@ -8409,6 +8500,7 @@
     <w:p>
       <w:pPr>
         <w:pStyle w:val="Normal"/>
+        <w:jc w:val="both"/>
       </w:pPr>
       <w:r>
         <w:rPr/>
@@ -8438,6 +8530,7 @@
     <w:p>
       <w:pPr>
         <w:pStyle w:val="PargrafodaLista"/>
+        <w:jc w:val="both"/>
       </w:pPr>
       <w:r>
         <w:rPr>
@@ -8453,6 +8546,7 @@
     <w:p>
       <w:pPr>
         <w:pStyle w:val="Normal"/>
+        <w:jc w:val="both"/>
       </w:pPr>
       <w:r>
         <w:rPr/>
@@ -8472,6 +8566,7 @@
     <w:p>
       <w:pPr>
         <w:pStyle w:val="PargrafodaLista"/>
+        <w:jc w:val="both"/>
       </w:pPr>
       <w:r>
         <w:rPr>
@@ -8487,6 +8582,7 @@
     <w:p>
       <w:pPr>
         <w:pStyle w:val="Normal"/>
+        <w:jc w:val="both"/>
       </w:pPr>
       <w:r>
         <w:rPr/>
@@ -8513,6 +8609,7 @@
     <w:p>
       <w:pPr>
         <w:pStyle w:val="Normal"/>
+        <w:jc w:val="both"/>
       </w:pPr>
       <w:r>
         <w:rPr/>
@@ -8532,6 +8629,7 @@
     <w:p>
       <w:pPr>
         <w:pStyle w:val="Normal"/>
+        <w:jc w:val="both"/>
       </w:pPr>
       <w:r>
         <w:rPr/>
@@ -8561,6 +8659,7 @@
     <w:p>
       <w:pPr>
         <w:pStyle w:val="Normal"/>
+        <w:jc w:val="both"/>
       </w:pPr>
       <w:r>
         <w:rPr/>
@@ -8661,6 +8760,7 @@
           <w:ilvl w:val="0"/>
           <w:numId w:val="1"/>
         </w:numPr>
+        <w:jc w:val="both"/>
       </w:pPr>
       <w:r>
         <w:rPr/>
@@ -8684,6 +8784,7 @@
           <w:ilvl w:val="0"/>
           <w:numId w:val="1"/>
         </w:numPr>
+        <w:jc w:val="both"/>
       </w:pPr>
       <w:r>
         <w:rPr/>
@@ -8717,6 +8818,7 @@
           <w:ilvl w:val="0"/>
           <w:numId w:val="1"/>
         </w:numPr>
+        <w:jc w:val="both"/>
       </w:pPr>
       <w:r>
         <w:rPr/>
@@ -8740,6 +8842,7 @@
           <w:ilvl w:val="0"/>
           <w:numId w:val="1"/>
         </w:numPr>
+        <w:jc w:val="both"/>
       </w:pPr>
       <w:r>
         <w:rPr/>
@@ -8763,6 +8866,7 @@
           <w:ilvl w:val="0"/>
           <w:numId w:val="1"/>
         </w:numPr>
+        <w:jc w:val="both"/>
       </w:pPr>
       <w:r>
         <w:rPr/>
@@ -8786,6 +8890,7 @@
           <w:ilvl w:val="0"/>
           <w:numId w:val="1"/>
         </w:numPr>
+        <w:jc w:val="both"/>
       </w:pPr>
       <w:r>
         <w:rPr/>

</xml_diff>

<commit_message>
docs: titulo do relatorio centralizado, 16pt e em caixa alta
</commit_message>
<xml_diff>
--- a/docs/RELATORIO-TECNICO.docx
+++ b/docs/RELATORIO-TECNICO.docx
@@ -5,9 +5,15 @@
     <w:p>
       <w:pPr>
         <w:pStyle w:val="Ttulo"/>
-      </w:pPr>
-      <w:r>
-        <w:rPr/>
+        <w:spacing w:before="240" w:after="240"/>
+        <w:jc w:val="center"/>
+      </w:pPr>
+      <w:r>
+        <w:rPr>
+          <w:caps/>
+          <w:sz w:val="32"/>
+          <w:szCs w:val="32"/>
+        </w:rPr>
         <w:t xml:space="preserve">RELATÓRIO TÉCNICO — Data Warehouse Organizacional e DataMarts</w:t>
       </w:r>
     </w:p>

</xml_diff>